<commit_message>
Remove Projects section from current resume
</commit_message>
<xml_diff>
--- a/2026_09/output/Raymond_Xu_Resume.docx
+++ b/2026_09/output/Raymond_Xu_Resume.docx
@@ -376,37 +376,6 @@
         <w:keepLines/>
       </w:pPr>
       <w:r>
-        <w:t>Projects</w:t>
-      </w:r>
-    </w:p>
-    <w:p>
-      <w:pPr>
-        <w:keepNext/>
-        <w:keepLines/>
-        <w:spacing w:before="80" w:after="0"/>
-      </w:pPr>
-      <w:r>
-        <w:rPr>
-          <w:b/>
-        </w:rPr>
-        <w:t>pytest-depper | github.com/ryx2/pytest-depper</w:t>
-      </w:r>
-    </w:p>
-    <w:p>
-      <w:pPr>
-        <w:pStyle w:val="ListBullet"/>
-        <w:keepLines/>
-      </w:pPr>
-      <w:r>
-        <w:t>Built a Python pytest plugin that uses Git changes and AST dependency analysis to select affected tests.</w:t>
-      </w:r>
-    </w:p>
-    <w:p>
-      <w:pPr>
-        <w:pStyle w:val="Heading1"/>
-        <w:keepLines/>
-      </w:pPr>
-      <w:r>
         <w:t>Education</w:t>
       </w:r>
     </w:p>

</xml_diff>